<commit_message>
A/B upgrades HH (1200 parties, objection user VALIDÉE) : l'achat inconditionnel coûtait 5,2 pts de win-rate — garde-fou câblé (achat seulement si >=2 CP restants, HH seulement), Ride Down II remonte de -4,5% à -1,5% (neutre) sous la règle. Rapport v4 §5.1 ajouté
Co-Authored-By: Claude Fable 5 <noreply@anthropic.com>
Claude-Session: https://claude.ai/code/session_01Fos6ri5iVUs1Z7HuNKf1D1
</commit_message>
<xml_diff>
--- a/calibration/Analyse_Calibration_v4.docx
+++ b/calibration/Analyse_Calibration_v4.docx
@@ -3262,12 +3262,180 @@
       </w:r>
     </w:p>
     <w:p>
+      <w:pPr>
+        <w:pStyle w:val="Heading2"/>
+      </w:pPr>
+      <w:r>
+        <w:t>5.1 Verdict de l’A/B (ajouté après l’objection de l’utilisateur — 1 200 parties)</w:t>
+      </w:r>
+    </w:p>
+    <w:p>
+      <w:r>
+        <w:rPr>
+          <w:b/>
+          <w:i w:val="0"/>
+        </w:rPr>
+        <w:t>L’objection « ce serait stupide de vendre tous les upgrades, surtout en excédent de CP » a été testée le soir même : mêmes 300 paires de parties par condition, avec une seule variante de politique — le Horseman n’achète un upgrade que s’il lui reste au moins 2 CP après l’achat.</w:t>
+      </w:r>
+    </w:p>
+    <w:tbl>
+      <w:tblPr>
+        <w:tblStyle w:val="LightGrid-Accent1"/>
+        <w:tblW w:type="auto" w:w="0"/>
+        <w:tblLook w:firstColumn="1" w:firstRow="1" w:lastColumn="0" w:lastRow="0" w:noHBand="0" w:noVBand="1" w:val="04A0"/>
+      </w:tblPr>
+      <w:tblGrid>
+        <w:gridCol w:w="4320"/>
+        <w:gridCol w:w="4320"/>
+      </w:tblGrid>
+      <w:tr>
+        <w:tc>
+          <w:tcPr>
+            <w:tcW w:type="dxa" w:w="4320"/>
+          </w:tcPr>
+          <w:p>
+            <w:r>
+              <w:rPr>
+                <w:b/>
+              </w:rPr>
+              <w:t>Condition</w:t>
+            </w:r>
+          </w:p>
+        </w:tc>
+        <w:tc>
+          <w:tcPr>
+            <w:tcW w:type="dxa" w:w="4320"/>
+          </w:tcPr>
+          <w:p>
+            <w:r>
+              <w:rPr>
+                <w:b/>
+              </w:rPr>
+              <w:t>Taux de victoire HH</w:t>
+            </w:r>
+          </w:p>
+        </w:tc>
+      </w:tr>
+      <w:tr>
+        <w:tc>
+          <w:tcPr>
+            <w:tcW w:type="dxa" w:w="4320"/>
+          </w:tcPr>
+          <w:p>
+            <w:r>
+              <w:t>Base, politique v4 (achat immédiat)</w:t>
+            </w:r>
+          </w:p>
+        </w:tc>
+        <w:tc>
+          <w:tcPr>
+            <w:tcW w:type="dxa" w:w="4320"/>
+          </w:tcPr>
+          <w:p>
+            <w:r>
+              <w:t>45,5 % ± 2,9</w:t>
+            </w:r>
+          </w:p>
+        </w:tc>
+      </w:tr>
+      <w:tr>
+        <w:tc>
+          <w:tcPr>
+            <w:tcW w:type="dxa" w:w="4320"/>
+          </w:tcPr>
+          <w:p>
+            <w:r>
+              <w:t>Base, politique économe</w:t>
+            </w:r>
+          </w:p>
+        </w:tc>
+        <w:tc>
+          <w:tcPr>
+            <w:tcW w:type="dxa" w:w="4320"/>
+          </w:tcPr>
+          <w:p>
+            <w:r>
+              <w:t>50,7 % ± 2,9</w:t>
+            </w:r>
+          </w:p>
+        </w:tc>
+      </w:tr>
+      <w:tr>
+        <w:tc>
+          <w:tcPr>
+            <w:tcW w:type="dxa" w:w="4320"/>
+          </w:tcPr>
+          <w:p>
+            <w:r>
+              <w:t>+ Ride Down II en main, politique v4</w:t>
+            </w:r>
+          </w:p>
+        </w:tc>
+        <w:tc>
+          <w:tcPr>
+            <w:tcW w:type="dxa" w:w="4320"/>
+          </w:tcPr>
+          <w:p>
+            <w:r>
+              <w:t>41,0 % ± 2,8</w:t>
+            </w:r>
+          </w:p>
+        </w:tc>
+      </w:tr>
+      <w:tr>
+        <w:tc>
+          <w:tcPr>
+            <w:tcW w:type="dxa" w:w="4320"/>
+          </w:tcPr>
+          <w:p>
+            <w:r>
+              <w:t>+ Ride Down II en main, politique économe</w:t>
+            </w:r>
+          </w:p>
+        </w:tc>
+        <w:tc>
+          <w:tcPr>
+            <w:tcW w:type="dxa" w:w="4320"/>
+          </w:tcPr>
+          <w:p>
+            <w:r>
+              <w:t>49,2 % ± 2,9</w:t>
+            </w:r>
+          </w:p>
+        </w:tc>
+      </w:tr>
+    </w:tbl>
+    <w:p>
+      <w:pPr>
+        <w:pStyle w:val="ListBullet"/>
+      </w:pPr>
+      <w:r>
+        <w:t>La règle économe, à elle seule, vaut +5,2 points de victoire au Horseman. Le diagnostic l’explique : la politique v4 achetait Ride Down II dans 19 parties sur 20, majoritairement aux tours 1 et 2, en vidant son portefeuille.</w:t>
+      </w:r>
+    </w:p>
+    <w:p>
+      <w:pPr>
+        <w:pStyle w:val="ListBullet"/>
+      </w:pPr>
+      <w:r>
+        <w:t>Sous la politique économe, Ride Down II remonte de -4,5 % à -1,5 % ± 4,1 : compatible avec une valeur neutre. Le verdict honnête n’est donc pas « la carte est mauvaise » mais « son achat au mauvais moment est mauvais, et l’IA de la v4 ne savait acheter qu’au mauvais moment ».</w:t>
+      </w:r>
+    </w:p>
+    <w:p>
+      <w:pPr>
+        <w:pStyle w:val="ListBullet"/>
+      </w:pPr>
+      <w:r>
+        <w:t>Conséquence appliquée au moteur : la règle « garder 2 CP après achat » est désormais câblée pour le Horseman (Black Widow conserve l’achat systématique, ses upgrades mesurant +2 à +3). Les verdicts VENDRE du §4 restent valides pour la main de départ, mais les upgrades HH doivent se lire « à jouer en excédent de CP, à vendre sous pression », exactement l’intuition de l’utilisateur.</w:t>
+      </w:r>
+    </w:p>
+    <w:p>
       <w:r>
         <w:rPr>
           <w:b w:val="0"/>
           <w:i w:val="0"/>
         </w:rPr>
-        <w:t>Actions proposées (aucune lancée sans ton accord) : un bras conditionnel « achat seulement si avantage de PV » pour séparer la carte du timing ; et une règle de politique « n’achète un upgrade HH que s’il reste au moins 2 CP après » à mesurer en A/B.</w:t>
+        <w:t>Actions restantes : re-mesurer les huit upgrades HH au banc complet sous la politique économe (probable remontée générale), idéalement après le ré-entraînement du réseau pour casser la boucle « le CP ne vaut rien parce qu’il est mal dépensé ».</w:t>
       </w:r>
     </w:p>
     <w:p>

</xml_diff>